<commit_message>
Resume: Internal Audit-Bengaluru-Associate-Technology Audit @ Goldman Sachs (MNC)
</commit_message>
<xml_diff>
--- a/resumes/Resume_Internal_Audit-Bengaluru-Associate-_Goldman_Sachs__MNC_.docx
+++ b/resumes/Resume_Internal_Audit-Bengaluru-Associate-_Goldman_Sachs__MNC_.docx
@@ -4,7 +4,7 @@
   <w:body>
     <w:p>
       <w:pPr>
-        <w:spacing w:after="44"/>
+        <w:spacing w:after="0" w:before="20"/>
         <w:jc w:val="center"/>
       </w:pPr>
       <w:r>
@@ -21,6 +21,7 @@
     </w:p>
     <w:p>
       <w:pPr>
+        <w:spacing w:before="20" w:after="0"/>
         <w:jc w:val="center"/>
       </w:pPr>
       <w:r>
@@ -116,7 +117,7 @@
         <w:pBdr>
           <w:bottom w:val="single" w:sz="6" w:space="1" w:color="000000"/>
         </w:pBdr>
-        <w:spacing w:before="360" w:after="52"/>
+        <w:spacing w:before="116" w:after="0"/>
       </w:pPr>
       <w:r>
         <w:rPr>
@@ -127,12 +128,48 @@
           <w:sz w:val="22"/>
           <w:szCs w:val="22"/>
         </w:rPr>
-        <w:t>Professional Summary</w:t>
-      </w:r>
-    </w:p>
-    <w:p>
-      <w:pPr>
-        <w:spacing w:before="8"/>
+        <w:t>Education</w:t>
+      </w:r>
+    </w:p>
+    <w:p>
+      <w:pPr>
+        <w:tabs>
+          <w:tab w:val="right" w:pos="10800"/>
+        </w:tabs>
+        <w:spacing w:before="20" w:after="0"/>
+      </w:pPr>
+      <w:r>
+        <w:rPr>
+          <w:rFonts w:ascii="Source Sans Pro" w:eastAsia="Source Sans Pro" w:hAnsi="Source Sans Pro" w:cs="Source Sans Pro"/>
+          <w:b/>
+          <w:bCs/>
+          <w:color w:val="000000"/>
+          <w:sz w:val="19"/>
+          <w:szCs w:val="19"/>
+        </w:rPr>
+        <w:t>Presidency College</w:t>
+      </w:r>
+      <w:r>
+        <w:rPr>
+          <w:rFonts w:ascii="Source Sans Pro" w:eastAsia="Source Sans Pro" w:hAnsi="Source Sans Pro" w:cs="Source Sans Pro"/>
+          <w:sz w:val="19"/>
+          <w:szCs w:val="19"/>
+        </w:rPr>
+        <w:tab/>
+      </w:r>
+      <w:r>
+        <w:rPr>
+          <w:rFonts w:ascii="Source Sans Pro" w:eastAsia="Source Sans Pro" w:hAnsi="Source Sans Pro" w:cs="Source Sans Pro"/>
+          <w:color w:val="555555"/>
+          <w:sz w:val="19"/>
+          <w:szCs w:val="19"/>
+        </w:rPr>
+        <w:t>2021 – 2023</w:t>
+      </w:r>
+    </w:p>
+    <w:p>
+      <w:pPr>
+        <w:spacing w:before="8" w:after="0"/>
       </w:pPr>
       <w:r>
         <w:rPr>
@@ -143,26 +180,7 @@
           <w:sz w:val="17"/>
           <w:szCs w:val="17"/>
         </w:rPr>
-        <w:t>Entry-level cybersecurity professional with hands-on experience in IT audit, ITGC, SOX, and compliance. Utilized Python, Bash, Linux, Splunk, Wireshark, Nmap, and Burp Suite to identify control gaps and ensure audit documentation quality. Applied root cause analysis and policy-based case evaluation to drive risk management and control testing.</w:t>
-      </w:r>
-    </w:p>
-    <w:p>
-      <w:pPr>
-        <w:pBdr>
-          <w:bottom w:val="single" w:sz="6" w:space="1" w:color="000000"/>
-        </w:pBdr>
-        <w:spacing w:before="360" w:after="52"/>
-      </w:pPr>
-      <w:r>
-        <w:rPr>
-          <w:rFonts w:ascii="Source Sans Pro" w:eastAsia="Source Sans Pro" w:hAnsi="Source Sans Pro" w:cs="Source Sans Pro"/>
-          <w:b/>
-          <w:bCs/>
-          <w:color w:val="000000"/>
-          <w:sz w:val="22"/>
-          <w:szCs w:val="22"/>
-        </w:rPr>
-        <w:t>Education</w:t>
+        <w:t>Master of Computer Applications (MCA)  ·  CGPA 7.29  · Bengaluru, India</w:t>
       </w:r>
     </w:p>
     <w:p>
@@ -170,7 +188,7 @@
         <w:tabs>
           <w:tab w:val="right" w:pos="10800"/>
         </w:tabs>
-        <w:spacing w:before="62"/>
+        <w:spacing w:before="20" w:after="0"/>
       </w:pPr>
       <w:r>
         <w:rPr>
@@ -181,7 +199,7 @@
           <w:sz w:val="19"/>
           <w:szCs w:val="19"/>
         </w:rPr>
-        <w:t>Presidency College</w:t>
+        <w:t>St. Claret College</w:t>
       </w:r>
       <w:r>
         <w:rPr>
@@ -198,12 +216,12 @@
           <w:sz w:val="19"/>
           <w:szCs w:val="19"/>
         </w:rPr>
-        <w:t>2021 – 2023</w:t>
-      </w:r>
-    </w:p>
-    <w:p>
-      <w:pPr>
-        <w:spacing w:before="8"/>
+        <w:t>2018 – 2021</w:t>
+      </w:r>
+    </w:p>
+    <w:p>
+      <w:pPr>
+        <w:spacing w:before="8" w:after="0"/>
       </w:pPr>
       <w:r>
         <w:rPr>
@@ -214,7 +232,7 @@
           <w:sz w:val="17"/>
           <w:szCs w:val="17"/>
         </w:rPr>
-        <w:t>Master of Computer Applications (MCA)  ·  CGPA 7.29  · Bengaluru, India</w:t>
+        <w:t>Bachelor of Computer Applications (BCA)  ·  CGPA 7.21  ·  Bengaluru, India</w:t>
       </w:r>
     </w:p>
     <w:p>
@@ -222,7 +240,7 @@
         <w:tabs>
           <w:tab w:val="right" w:pos="10800"/>
         </w:tabs>
-        <w:spacing w:before="62"/>
+        <w:spacing w:before="20" w:after="0"/>
       </w:pPr>
       <w:r>
         <w:rPr>
@@ -233,7 +251,7 @@
           <w:sz w:val="19"/>
           <w:szCs w:val="19"/>
         </w:rPr>
-        <w:t>St. Claret College</w:t>
+        <w:t>St. Claret PU College</w:t>
       </w:r>
       <w:r>
         <w:rPr>
@@ -250,12 +268,12 @@
           <w:sz w:val="19"/>
           <w:szCs w:val="19"/>
         </w:rPr>
-        <w:t>2018 – 2021</w:t>
-      </w:r>
-    </w:p>
-    <w:p>
-      <w:pPr>
-        <w:spacing w:before="8"/>
+        <w:t>2016 – 2018</w:t>
+      </w:r>
+    </w:p>
+    <w:p>
+      <w:pPr>
+        <w:spacing w:before="8" w:after="0"/>
       </w:pPr>
       <w:r>
         <w:rPr>
@@ -266,7 +284,31 @@
           <w:sz w:val="17"/>
           <w:szCs w:val="17"/>
         </w:rPr>
-        <w:t>Bachelor of Computer Applications (BCA)  ·  CGPA 7.21  ·  Bengaluru, India</w:t>
+        <w:t>Higher Secondary (12th)  ·  Bengaluru, India</w:t>
+      </w:r>
+    </w:p>
+    <w:p>
+      <w:pPr>
+        <w:spacing w:before="20" w:after="20"/>
+      </w:pPr>
+    </w:p>
+    <w:p>
+      <w:pPr>
+        <w:pBdr>
+          <w:bottom w:val="single" w:sz="6" w:space="1" w:color="000000"/>
+        </w:pBdr>
+        <w:spacing w:before="116" w:after="0"/>
+      </w:pPr>
+      <w:r>
+        <w:rPr>
+          <w:rFonts w:ascii="Source Sans Pro" w:eastAsia="Source Sans Pro" w:hAnsi="Source Sans Pro" w:cs="Source Sans Pro"/>
+          <w:b/>
+          <w:bCs/>
+          <w:color w:val="000000"/>
+          <w:sz w:val="22"/>
+          <w:szCs w:val="22"/>
+        </w:rPr>
+        <w:t>Work Experience</w:t>
       </w:r>
     </w:p>
     <w:p>
@@ -274,7 +316,7 @@
         <w:tabs>
           <w:tab w:val="right" w:pos="10800"/>
         </w:tabs>
-        <w:spacing w:before="62"/>
+        <w:spacing w:before="20" w:after="0"/>
       </w:pPr>
       <w:r>
         <w:rPr>
@@ -285,7 +327,7 @@
           <w:sz w:val="19"/>
           <w:szCs w:val="19"/>
         </w:rPr>
-        <w:t>St. Claret PU College</w:t>
+        <w:t>Support Operations Specialist</w:t>
       </w:r>
       <w:r>
         <w:rPr>
@@ -298,51 +340,19 @@
       <w:r>
         <w:rPr>
           <w:rFonts w:ascii="Source Sans Pro" w:eastAsia="Source Sans Pro" w:hAnsi="Source Sans Pro" w:cs="Source Sans Pro"/>
+          <w:sz w:val="19"/>
+          <w:szCs w:val="19"/>
+        </w:rPr>
+        <w:t xml:space="preserve">  </w:t>
+      </w:r>
+      <w:r>
+        <w:rPr>
+          <w:rFonts w:ascii="Source Sans Pro" w:eastAsia="Source Sans Pro" w:hAnsi="Source Sans Pro" w:cs="Source Sans Pro"/>
           <w:color w:val="555555"/>
           <w:sz w:val="19"/>
           <w:szCs w:val="19"/>
         </w:rPr>
-        <w:t>2016 – 2018</w:t>
-      </w:r>
-    </w:p>
-    <w:p>
-      <w:pPr>
-        <w:spacing w:before="8"/>
-      </w:pPr>
-      <w:r>
-        <w:rPr>
-          <w:rFonts w:ascii="Source Sans Pro" w:eastAsia="Source Sans Pro" w:hAnsi="Source Sans Pro" w:cs="Source Sans Pro"/>
-          <w:i/>
-          <w:iCs/>
-          <w:color w:val="555555"/>
-          <w:sz w:val="17"/>
-          <w:szCs w:val="17"/>
-        </w:rPr>
-        <w:t>Higher Secondary (12th)  ·  Bengaluru, India</w:t>
-      </w:r>
-    </w:p>
-    <w:p>
-      <w:pPr>
-        <w:spacing w:before="8"/>
-      </w:pPr>
-    </w:p>
-    <w:p>
-      <w:pPr>
-        <w:pBdr>
-          <w:bottom w:val="single" w:sz="6" w:space="1" w:color="000000"/>
-        </w:pBdr>
-        <w:spacing w:before="155" w:after="52"/>
-      </w:pPr>
-      <w:r>
-        <w:rPr>
-          <w:rFonts w:ascii="Source Sans Pro" w:eastAsia="Source Sans Pro" w:hAnsi="Source Sans Pro" w:cs="Source Sans Pro"/>
-          <w:b/>
-          <w:bCs/>
-          <w:color w:val="000000"/>
-          <w:sz w:val="22"/>
-          <w:szCs w:val="22"/>
-        </w:rPr>
-        <w:t>Work Experience</w:t>
+        <w:t>Jun. 2024 – Jan. 2026</w:t>
       </w:r>
     </w:p>
     <w:p>
@@ -350,51 +360,7 @@
         <w:tabs>
           <w:tab w:val="right" w:pos="10800"/>
         </w:tabs>
-        <w:spacing w:before="62"/>
-      </w:pPr>
-      <w:r>
-        <w:rPr>
-          <w:rFonts w:ascii="Source Sans Pro" w:eastAsia="Source Sans Pro" w:hAnsi="Source Sans Pro" w:cs="Source Sans Pro"/>
-          <w:b/>
-          <w:bCs/>
-          <w:color w:val="000000"/>
-          <w:sz w:val="19"/>
-          <w:szCs w:val="19"/>
-        </w:rPr>
-        <w:t>Support Operations Specialist</w:t>
-      </w:r>
-      <w:r>
-        <w:rPr>
-          <w:rFonts w:ascii="Source Sans Pro" w:eastAsia="Source Sans Pro" w:hAnsi="Source Sans Pro" w:cs="Source Sans Pro"/>
-          <w:sz w:val="19"/>
-          <w:szCs w:val="19"/>
-        </w:rPr>
-        <w:tab/>
-      </w:r>
-      <w:r>
-        <w:rPr>
-          <w:rFonts w:ascii="Source Sans Pro" w:eastAsia="Source Sans Pro" w:hAnsi="Source Sans Pro" w:cs="Source Sans Pro"/>
-          <w:sz w:val="19"/>
-          <w:szCs w:val="19"/>
-        </w:rPr>
-        <w:t xml:space="preserve">  </w:t>
-      </w:r>
-      <w:r>
-        <w:rPr>
-          <w:rFonts w:ascii="Source Sans Pro" w:eastAsia="Source Sans Pro" w:hAnsi="Source Sans Pro" w:cs="Source Sans Pro"/>
-          <w:color w:val="555555"/>
-          <w:sz w:val="19"/>
-          <w:szCs w:val="19"/>
-        </w:rPr>
-        <w:t>Jun. 2024 – Jan. 2026</w:t>
-      </w:r>
-    </w:p>
-    <w:p>
-      <w:pPr>
-        <w:tabs>
-          <w:tab w:val="right" w:pos="10800"/>
-        </w:tabs>
-        <w:spacing w:before="8"/>
+        <w:spacing w:before="8" w:after="0"/>
       </w:pPr>
       <w:r>
         <w:rPr>
@@ -438,34 +404,16 @@
           <w:ilvl w:val="0"/>
           <w:numId w:val="2"/>
         </w:numPr>
-        <w:spacing w:before="13" w:after="13"/>
-      </w:pPr>
-      <w:r>
-        <w:rPr>
-          <w:rFonts w:ascii="Source Sans Pro" w:eastAsia="Source Sans Pro" w:hAnsi="Source Sans Pro" w:cs="Source Sans Pro"/>
-          <w:color w:val="000000"/>
-          <w:sz w:val="19"/>
-          <w:szCs w:val="19"/>
-        </w:rPr>
-        <w:t>Triaged 50+ weekly inventory reimbursement cases by severity and policy eligibility, mirroring the structured alert triage and escalation workflow used in SOC Tier 1 analyst roles.</w:t>
-      </w:r>
-      <w:proofErr w:type="spellStart"/>
-      <w:r>
-        <w:rPr>
-          <w:rFonts w:ascii="Source Sans Pro" w:eastAsia="Source Sans Pro" w:hAnsi="Source Sans Pro" w:cs="Source Sans Pro"/>
-          <w:color w:val="000000"/>
-          <w:sz w:val="19"/>
-          <w:szCs w:val="19"/>
-        </w:rPr>
-      </w:r>
-      <w:proofErr w:type="spellEnd"/>
-      <w:r>
-        <w:rPr>
-          <w:rFonts w:ascii="Source Sans Pro" w:eastAsia="Source Sans Pro" w:hAnsi="Source Sans Pro" w:cs="Source Sans Pro"/>
-          <w:color w:val="000000"/>
-          <w:sz w:val="19"/>
-          <w:szCs w:val="19"/>
-        </w:rPr>
+        <w:spacing w:before="13" w:after="33"/>
+      </w:pPr>
+      <w:r>
+        <w:rPr>
+          <w:rFonts w:ascii="Source Sans Pro" w:eastAsia="Source Sans Pro" w:hAnsi="Source Sans Pro" w:cs="Source Sans Pro"/>
+          <w:color w:val="000000"/>
+          <w:sz w:val="19"/>
+          <w:szCs w:val="19"/>
+        </w:rPr>
+        <w:t>Triaged 50+ weekly inventory reimbursement cases by severity and policy eligibility, leveraging structured alert triage and escalation workflow used in internal audit.</w:t>
       </w:r>
     </w:p>
     <w:p>
@@ -475,16 +423,16 @@
           <w:ilvl w:val="0"/>
           <w:numId w:val="2"/>
         </w:numPr>
-        <w:spacing w:before="13" w:after="13"/>
-      </w:pPr>
-      <w:r>
-        <w:rPr>
-          <w:rFonts w:ascii="Source Sans Pro" w:eastAsia="Source Sans Pro" w:hAnsi="Source Sans Pro" w:cs="Source Sans Pro"/>
-          <w:color w:val="000000"/>
-          <w:sz w:val="19"/>
-          <w:szCs w:val="19"/>
-        </w:rPr>
-        <w:t>Performed root cause analysis on seller claims to identify policy violations and anomalous patterns; escalated findings to senior reviewers, demonstrating investigative instincts central to SOC and fraud analyst operations.</w:t>
+        <w:spacing w:before="13" w:after="33"/>
+      </w:pPr>
+      <w:r>
+        <w:rPr>
+          <w:rFonts w:ascii="Source Sans Pro" w:eastAsia="Source Sans Pro" w:hAnsi="Source Sans Pro" w:cs="Source Sans Pro"/>
+          <w:color w:val="000000"/>
+          <w:sz w:val="19"/>
+          <w:szCs w:val="19"/>
+        </w:rPr>
+        <w:t>Conducted root cause analysis on seller claims, identifying policy violations and anomalous patterns, and escalated findings to senior reviewers.</w:t>
       </w:r>
     </w:p>
     <w:p>
@@ -494,16 +442,16 @@
           <w:ilvl w:val="0"/>
           <w:numId w:val="2"/>
         </w:numPr>
-        <w:spacing w:before="13" w:after="13"/>
-      </w:pPr>
-      <w:r>
-        <w:rPr>
-          <w:rFonts w:ascii="Source Sans Pro" w:eastAsia="Source Sans Pro" w:hAnsi="Source Sans Pro" w:cs="Source Sans Pro"/>
-          <w:color w:val="000000"/>
-          <w:sz w:val="19"/>
-          <w:szCs w:val="19"/>
-        </w:rPr>
-        <w:t>Maintained audit-ready case documentation recording investigation findings, decisions, and corrective actions, establishing the evidence chain-of-custody discipline required for security incident reporting and IT audit.</w:t>
+        <w:spacing w:before="13" w:after="33"/>
+      </w:pPr>
+      <w:r>
+        <w:rPr>
+          <w:rFonts w:ascii="Source Sans Pro" w:eastAsia="Source Sans Pro" w:hAnsi="Source Sans Pro" w:cs="Source Sans Pro"/>
+          <w:color w:val="000000"/>
+          <w:sz w:val="19"/>
+          <w:szCs w:val="19"/>
+        </w:rPr>
+        <w:t>Maintained audit-ready case documentation recording investigation findings, decisions, and corrective actions, establishing the evidence chain-of-custody discipline required for internal audit.</w:t>
       </w:r>
     </w:p>
     <w:p>
@@ -513,40 +461,56 @@
           <w:ilvl w:val="0"/>
           <w:numId w:val="2"/>
         </w:numPr>
-        <w:spacing w:before="13" w:after="13"/>
-      </w:pPr>
-      <w:r>
-        <w:rPr>
-          <w:rFonts w:ascii="Source Sans Pro" w:eastAsia="Source Sans Pro" w:hAnsi="Source Sans Pro" w:cs="Source Sans Pro"/>
-          <w:color w:val="000000"/>
-          <w:sz w:val="19"/>
-          <w:szCs w:val="19"/>
-        </w:rPr>
-        <w:t>Collaborated with compliance and risk teams to enforce regulatory policies, identify process vulnerabilities, and implement corrective controls, building operational instincts in risk management and compliance monitoring.</w:t>
-      </w:r>
+        <w:spacing w:before="13" w:after="33"/>
+      </w:pPr>
+      <w:r>
+        <w:rPr>
+          <w:rFonts w:ascii="Source Sans Pro" w:eastAsia="Source Sans Pro" w:hAnsi="Source Sans Pro" w:cs="Source Sans Pro"/>
+          <w:color w:val="000000"/>
+          <w:sz w:val="19"/>
+          <w:szCs w:val="19"/>
+        </w:rPr>
+        <w:t>[[AMZ_B</w:t>
+      </w:r>
+      <w:r>
+        <w:rPr>
+          <w:rFonts w:ascii="Source Sans Pro" w:eastAsia="Source Sans Pro" w:hAnsi="Source Sans Pro" w:cs="Source Sans Pro"/>
+          <w:color w:val="000000"/>
+          <w:sz w:val="19"/>
+          <w:szCs w:val="19"/>
+        </w:rPr>
+        <w:t>4</w:t>
+      </w:r>
+      <w:r>
+        <w:rPr>
+          <w:rFonts w:ascii="Source Sans Pro" w:eastAsia="Source Sans Pro" w:hAnsi="Source Sans Pro" w:cs="Source Sans Pro"/>
+          <w:color w:val="000000"/>
+          <w:sz w:val="19"/>
+          <w:szCs w:val="19"/>
+        </w:rPr>
+        <w:t>]]</w:t>
+      </w:r>
+    </w:p>
+    <w:p>
+      <w:pPr>
+        <w:pStyle w:val="ListParagraph"/>
+        <w:spacing w:before="20" w:after="20"/>
+        <w:ind w:left="450"/>
+      </w:pPr>
+    </w:p>
+    <w:p>
+      <w:pPr>
+        <w:pStyle w:val="ListParagraph"/>
+        <w:spacing w:before="20" w:after="20"/>
+        <w:ind w:left="450"/>
+      </w:pPr>
     </w:p>
     <w:p>
       <w:pPr>
         <w:pBdr>
           <w:bottom w:val="single" w:sz="6" w:space="1" w:color="000000"/>
         </w:pBdr>
-        <w:spacing w:before="155" w:after="52"/>
-        <w:rPr>
-          <w:rFonts w:ascii="Source Sans Pro" w:eastAsia="Source Sans Pro" w:hAnsi="Source Sans Pro" w:cs="Source Sans Pro"/>
-          <w:b/>
-          <w:bCs/>
-          <w:color w:val="000000"/>
-          <w:sz w:val="22"/>
-          <w:szCs w:val="22"/>
-        </w:rPr>
-      </w:pPr>
-    </w:p>
-    <w:p>
-      <w:pPr>
-        <w:pBdr>
-          <w:bottom w:val="single" w:sz="6" w:space="1" w:color="000000"/>
-        </w:pBdr>
-        <w:spacing w:before="155" w:after="52"/>
+        <w:spacing w:before="116" w:after="0"/>
       </w:pPr>
       <w:r>
         <w:rPr>
@@ -565,76 +529,19 @@
         <w:tabs>
           <w:tab w:val="right" w:pos="10800"/>
         </w:tabs>
-        <w:spacing w:before="62"/>
-      </w:pPr>
-      <w:r>
-        <w:rPr>
-          <w:rFonts w:ascii="Source Sans Pro" w:eastAsia="Source Sans Pro" w:hAnsi="Source Sans Pro" w:cs="Source Sans Pro"/>
-          <w:b/>
-          <w:bCs/>
-          <w:color w:val="000000"/>
-          <w:sz w:val="19"/>
-          <w:szCs w:val="19"/>
-        </w:rPr>
-        <w:t xml:space="preserve">GRC Compliance Automation &amp; Risk Intelligence Framework  |  </w:t>
-        <w:tab/>
-        <w:t>Python, NIST CSF, ISO 27001, PCI-DSS, GDPR/PDPB, Excel, Git</w:t>
-      </w:r>
-      <w:r>
-        <w:rPr>
-          <w:rFonts w:ascii="Source Sans Pro" w:eastAsia="Source Sans Pro" w:hAnsi="Source Sans Pro" w:cs="Source Sans Pro"/>
-          <w:color w:val="555555"/>
-          <w:sz w:val="19"/>
-          <w:szCs w:val="19"/>
-        </w:rPr>
-      </w:r>
-      <w:hyperlink r:id="rId8" w:history="1">
+        <w:spacing w:before="20" w:after="0"/>
+      </w:pPr>
+      <w:hyperlink r:id="rId8">
         <w:r>
           <w:rPr>
-            <w:noProof/>
+            <w:rFonts w:ascii="Source Sans Pro" w:eastAsia="Source Sans Pro" w:hAnsi="Source Sans Pro" w:cs="Source Sans Pro"/>
+            <w:b/>
+            <w:color w:val="000000"/>
+            <w:sz w:val="19"/>
+            <w:szCs w:val="19"/>
+            <w:u w:val="single"/>
           </w:rPr>
-          <w:drawing>
-            <wp:inline distT="0" distB="0" distL="0" distR="0" wp14:anchorId="7B56B168" wp14:editId="47E0EAC7">
-              <wp:extent cx="104775" cy="104775"/>
-              <wp:effectExtent l="0" t="0" r="0" b="0"/>
-              <wp:docPr id="1471047774" name="Picture 1471047774">
-                <a:hlinkClick xmlns:a="http://schemas.openxmlformats.org/drawingml/2006/main" r:id="rId8"/>
-              </wp:docPr>
-              <wp:cNvGraphicFramePr>
-                <a:graphicFrameLocks xmlns:a="http://schemas.openxmlformats.org/drawingml/2006/main" noChangeAspect="1"/>
-              </wp:cNvGraphicFramePr>
-              <a:graphic xmlns:a="http://schemas.openxmlformats.org/drawingml/2006/main">
-                <a:graphicData uri="http://schemas.openxmlformats.org/drawingml/2006/picture">
-                  <pic:pic xmlns:pic="http://schemas.openxmlformats.org/drawingml/2006/picture">
-                    <pic:nvPicPr>
-                      <pic:cNvPr id="0" name="">
-                        <a:hlinkClick r:id="rId8"/>
-                      </pic:cNvPr>
-                      <pic:cNvPicPr>
-                        <a:picLocks noChangeAspect="1" noChangeArrowheads="1"/>
-                      </pic:cNvPicPr>
-                    </pic:nvPicPr>
-                    <pic:blipFill>
-                      <a:blip r:embed="rId9"/>
-                      <a:srcRect/>
-                      <a:stretch>
-                        <a:fillRect/>
-                      </a:stretch>
-                    </pic:blipFill>
-                    <pic:spPr bwMode="auto">
-                      <a:xfrm>
-                        <a:off x="0" y="0"/>
-                        <a:ext cx="104775" cy="104775"/>
-                      </a:xfrm>
-                      <a:prstGeom prst="rect">
-                        <a:avLst/>
-                      </a:prstGeom>
-                    </pic:spPr>
-                  </pic:pic>
-                </a:graphicData>
-              </a:graphic>
-            </wp:inline>
-          </w:drawing>
+          <w:t>Phishing and OSINT Threat Intelligence Tool</w:t>
         </w:r>
       </w:hyperlink>
       <w:r>
@@ -643,25 +550,25 @@
           <w:sz w:val="19"/>
           <w:szCs w:val="19"/>
         </w:rPr>
-      </w:r>
-      <w:r>
-        <w:rPr>
-          <w:rFonts w:ascii="Source Sans Pro" w:eastAsia="Source Sans Pro" w:hAnsi="Source Sans Pro" w:cs="Source Sans Pro"/>
-          <w:color w:val="555555"/>
-          <w:sz w:val="19"/>
-          <w:szCs w:val="19"/>
-        </w:rPr>
-      </w:r>
-      <w:proofErr w:type="spellStart"/>
-      <w:r>
-        <w:rPr>
-          <w:rFonts w:ascii="Source Sans Pro" w:eastAsia="Source Sans Pro" w:hAnsi="Source Sans Pro" w:cs="Source Sans Pro"/>
-          <w:color w:val="555555"/>
-          <w:sz w:val="19"/>
-          <w:szCs w:val="19"/>
-        </w:rPr>
-      </w:r>
-      <w:proofErr w:type="spellEnd"/>
+        <w:t xml:space="preserve">  |  </w:t>
+      </w:r>
+      <w:r>
+        <w:rPr>
+          <w:rFonts w:ascii="Source Sans Pro" w:eastAsia="Source Sans Pro" w:hAnsi="Source Sans Pro" w:cs="Source Sans Pro"/>
+          <w:sz w:val="19"/>
+          <w:szCs w:val="19"/>
+        </w:rPr>
+        <w:tab/>
+      </w:r>
+      <w:r>
+        <w:rPr>
+          <w:rFonts w:ascii="Source Sans Pro" w:eastAsia="Source Sans Pro" w:hAnsi="Source Sans Pro" w:cs="Source Sans Pro"/>
+          <w:i/>
+          <w:sz w:val="19"/>
+          <w:szCs w:val="19"/>
+        </w:rPr>
+        <w:t>Python, VirusTotal API, AbuseIPDB, WHOIS, Telegram bot</w:t>
+      </w:r>
     </w:p>
     <w:p>
       <w:pPr>
@@ -670,16 +577,16 @@
           <w:ilvl w:val="0"/>
           <w:numId w:val="2"/>
         </w:numPr>
-        <w:spacing w:before="13" w:after="13"/>
-      </w:pPr>
-      <w:r>
-        <w:rPr>
-          <w:rFonts w:ascii="Source Sans Pro" w:eastAsia="Source Sans Pro" w:hAnsi="Source Sans Pro" w:cs="Source Sans Pro"/>
-          <w:color w:val="000000"/>
-          <w:sz w:val="19"/>
-          <w:szCs w:val="19"/>
-        </w:rPr>
-        <w:t>Developed Python GRC compliance tool mapping controls to NIST CSF, ISO 27001, and PCI-DSS; auto-generates gap analysis reports scoring each domain and flagging non-compliant controls.</w:t>
+        <w:spacing w:before="13" w:after="33"/>
+      </w:pPr>
+      <w:r>
+        <w:rPr>
+          <w:rFonts w:ascii="Source Sans Pro" w:eastAsia="Source Sans Pro" w:hAnsi="Source Sans Pro" w:cs="Source Sans Pro"/>
+          <w:color w:val="000000"/>
+          <w:sz w:val="19"/>
+          <w:szCs w:val="19"/>
+        </w:rPr>
+        <w:t>Built multi-API threat intelligence pipeline: submits suspicious data to VirusTotal, AbuseIPDB, and URLScan.io; cross-references WHOIS, DNS, and SSL details for unified phishing probability score.</w:t>
       </w:r>
     </w:p>
     <w:p>
@@ -689,16 +596,16 @@
           <w:ilvl w:val="0"/>
           <w:numId w:val="2"/>
         </w:numPr>
-        <w:spacing w:before="13" w:after="13"/>
-      </w:pPr>
-      <w:r>
-        <w:rPr>
-          <w:rFonts w:ascii="Source Sans Pro" w:eastAsia="Source Sans Pro" w:hAnsi="Source Sans Pro" w:cs="Source Sans Pro"/>
-          <w:color w:val="000000"/>
-          <w:sz w:val="19"/>
-          <w:szCs w:val="19"/>
-        </w:rPr>
-        <w:t>Built automated third-party vendor risk module computing quantitative risk scores across 12 domains aligned with enterprise TPRM frameworks.</w:t>
+        <w:spacing w:before="13" w:after="33"/>
+      </w:pPr>
+      <w:r>
+        <w:rPr>
+          <w:rFonts w:ascii="Source Sans Pro" w:eastAsia="Source Sans Pro" w:hAnsi="Source Sans Pro" w:cs="Source Sans Pro"/>
+          <w:color w:val="000000"/>
+          <w:sz w:val="19"/>
+          <w:szCs w:val="19"/>
+        </w:rPr>
+        <w:t>Developed typosquatting detector generating domain variants and checking live DNS resolution to catch brand-impersonation attacks before they reach threat feeds (T1110).</w:t>
       </w:r>
     </w:p>
     <w:p>
@@ -708,52 +615,67 @@
           <w:ilvl w:val="0"/>
           <w:numId w:val="2"/>
         </w:numPr>
-        <w:spacing w:before="13" w:after="13"/>
-      </w:pPr>
-      <w:r>
-        <w:rPr>
-          <w:rFonts w:ascii="Source Sans Pro" w:eastAsia="Source Sans Pro" w:hAnsi="Source Sans Pro" w:cs="Source Sans Pro"/>
-          <w:color w:val="000000"/>
-          <w:sz w:val="19"/>
-          <w:szCs w:val="19"/>
-        </w:rPr>
-        <w:t>Implemented transaction anomaly detection engine flagging structuring, rapid velocity, and dormant account reactivation patterns applicable to fraud and AML roles.</w:t>
-      </w:r>
-      <w:proofErr w:type="spellStart"/>
-      <w:r>
-        <w:rPr>
-          <w:rFonts w:ascii="Source Sans Pro" w:eastAsia="Source Sans Pro" w:hAnsi="Source Sans Pro" w:cs="Source Sans Pro"/>
-          <w:color w:val="000000"/>
-          <w:sz w:val="19"/>
-          <w:szCs w:val="19"/>
-        </w:rPr>
-      </w:r>
-      <w:proofErr w:type="spellEnd"/>
-      <w:r>
-        <w:rPr>
-          <w:rFonts w:ascii="Source Sans Pro" w:eastAsia="Source Sans Pro" w:hAnsi="Source Sans Pro" w:cs="Source Sans Pro"/>
-          <w:color w:val="000000"/>
-          <w:sz w:val="19"/>
-          <w:szCs w:val="19"/>
-        </w:rPr>
-      </w:r>
-      <w:proofErr w:type="spellStart"/>
-      <w:r>
-        <w:rPr>
-          <w:rFonts w:ascii="Source Sans Pro" w:eastAsia="Source Sans Pro" w:hAnsi="Source Sans Pro" w:cs="Source Sans Pro"/>
-          <w:color w:val="000000"/>
-          <w:sz w:val="19"/>
-          <w:szCs w:val="19"/>
-        </w:rPr>
-      </w:r>
-      <w:proofErr w:type="spellEnd"/>
-      <w:r>
-        <w:rPr>
-          <w:rFonts w:ascii="Source Sans Pro" w:eastAsia="Source Sans Pro" w:hAnsi="Source Sans Pro" w:cs="Source Sans Pro"/>
-          <w:color w:val="000000"/>
-          <w:sz w:val="19"/>
-          <w:szCs w:val="19"/>
-        </w:rPr>
+        <w:spacing w:before="13" w:after="33"/>
+      </w:pPr>
+      <w:r>
+        <w:rPr>
+          <w:rFonts w:ascii="Source Sans Pro" w:eastAsia="Source Sans Pro" w:hAnsi="Source Sans Pro" w:cs="Source Sans Pro"/>
+          <w:color w:val="000000"/>
+          <w:sz w:val="19"/>
+          <w:szCs w:val="19"/>
+        </w:rPr>
+        <w:t>Deployed Telegram bot interface for live IOC enrichment, supporting bulk CSV input/output and OSINT enrichment via theHarvester for domain profiling.</w:t>
+      </w:r>
+    </w:p>
+    <w:p>
+      <w:pPr>
+        <w:spacing w:before="20" w:after="20"/>
+      </w:pPr>
+    </w:p>
+    <w:p>
+      <w:pPr>
+        <w:tabs>
+          <w:tab w:val="right" w:pos="10800"/>
+        </w:tabs>
+        <w:spacing w:before="30" w:after="0"/>
+      </w:pPr>
+      <w:hyperlink r:id="rId9">
+        <w:r>
+          <w:rPr>
+            <w:rFonts w:ascii="Source Sans Pro" w:eastAsia="Source Sans Pro" w:hAnsi="Source Sans Pro" w:cs="Source Sans Pro"/>
+            <w:b/>
+            <w:color w:val="000000"/>
+            <w:sz w:val="19"/>
+            <w:szCs w:val="19"/>
+            <w:u w:val="single"/>
+          </w:rPr>
+          <w:t>Vulnerability Scanner and Patch Prioritization Engine</w:t>
+        </w:r>
+      </w:hyperlink>
+      <w:r>
+        <w:rPr>
+          <w:rFonts w:ascii="Source Sans Pro" w:eastAsia="Source Sans Pro" w:hAnsi="Source Sans Pro" w:cs="Source Sans Pro"/>
+          <w:sz w:val="19"/>
+          <w:szCs w:val="19"/>
+        </w:rPr>
+        <w:t xml:space="preserve">  |  </w:t>
+      </w:r>
+      <w:r>
+        <w:rPr>
+          <w:rFonts w:ascii="Source Sans Pro" w:eastAsia="Source Sans Pro" w:hAnsi="Source Sans Pro" w:cs="Source Sans Pro"/>
+          <w:sz w:val="19"/>
+          <w:szCs w:val="19"/>
+        </w:rPr>
+        <w:tab/>
+      </w:r>
+      <w:r>
+        <w:rPr>
+          <w:rFonts w:ascii="Source Sans Pro" w:eastAsia="Source Sans Pro" w:hAnsi="Source Sans Pro" w:cs="Source Sans Pro"/>
+          <w:i/>
+          <w:sz w:val="19"/>
+          <w:szCs w:val="19"/>
+        </w:rPr>
+        <w:t>Python, Bash, Nessus, OpenVAS, NVD API</w:t>
       </w:r>
     </w:p>
     <w:p>
@@ -763,150 +685,16 @@
           <w:ilvl w:val="0"/>
           <w:numId w:val="2"/>
         </w:numPr>
-        <w:spacing w:before="13" w:after="13"/>
-      </w:pPr>
-      <w:r>
-        <w:rPr>
-          <w:rFonts w:ascii="Source Sans Pro" w:eastAsia="Source Sans Pro" w:hAnsi="Source Sans Pro" w:cs="Source Sans Pro"/>
-          <w:color w:val="000000"/>
-          <w:sz w:val="19"/>
-          <w:szCs w:val="19"/>
-        </w:rPr>
-        <w:t>Developed GDPR/PDPB audit checklist evaluating consent management, data minimisation, and breach notification compliance with scored outputs.</w:t>
-      </w:r>
-      <w:proofErr w:type="spellStart"/>
-      <w:r>
-        <w:rPr>
-          <w:rFonts w:ascii="Source Sans Pro" w:eastAsia="Source Sans Pro" w:hAnsi="Source Sans Pro" w:cs="Source Sans Pro"/>
-          <w:color w:val="000000"/>
-          <w:sz w:val="19"/>
-          <w:szCs w:val="19"/>
-        </w:rPr>
-      </w:r>
-      <w:proofErr w:type="spellEnd"/>
-      <w:r>
-        <w:rPr>
-          <w:rFonts w:ascii="Source Sans Pro" w:eastAsia="Source Sans Pro" w:hAnsi="Source Sans Pro" w:cs="Source Sans Pro"/>
-          <w:color w:val="000000"/>
-          <w:sz w:val="19"/>
-          <w:szCs w:val="19"/>
-        </w:rPr>
-      </w:r>
-      <w:proofErr w:type="spellStart"/>
-      <w:r>
-        <w:rPr>
-          <w:rFonts w:ascii="Source Sans Pro" w:eastAsia="Source Sans Pro" w:hAnsi="Source Sans Pro" w:cs="Source Sans Pro"/>
-          <w:color w:val="000000"/>
-          <w:sz w:val="19"/>
-          <w:szCs w:val="19"/>
-        </w:rPr>
-      </w:r>
-      <w:proofErr w:type="spellEnd"/>
-      <w:r>
-        <w:rPr>
-          <w:rFonts w:ascii="Source Sans Pro" w:eastAsia="Source Sans Pro" w:hAnsi="Source Sans Pro" w:cs="Source Sans Pro"/>
-          <w:color w:val="000000"/>
-          <w:sz w:val="19"/>
-          <w:szCs w:val="19"/>
-        </w:rPr>
-      </w:r>
-    </w:p>
-    <w:p>
-      <w:pPr>
-        <w:spacing w:before="30"/>
-      </w:pPr>
-    </w:p>
-    <w:p>
-      <w:pPr>
-        <w:tabs>
-          <w:tab w:val="right" w:pos="10800"/>
-        </w:tabs>
-        <w:spacing w:before="30"/>
-      </w:pPr>
-      <w:r>
-        <w:rPr>
-          <w:rFonts w:ascii="Source Sans Pro" w:eastAsia="Source Sans Pro" w:hAnsi="Source Sans Pro" w:cs="Source Sans Pro"/>
-          <w:b/>
-          <w:bCs/>
-          <w:color w:val="000000"/>
-          <w:sz w:val="19"/>
-          <w:szCs w:val="19"/>
-        </w:rPr>
-        <w:t xml:space="preserve">Cybersecurity SOC &amp; Threat Detection Home Lab  |  </w:t>
-        <w:tab/>
-        <w:t>Splunk (SPL), Wireshark, Nmap, Burp Suite, Linux, MITRE ATT&amp;CK, TryHackMe</w:t>
-      </w:r>
-      <w:r>
-        <w:rPr>
-          <w:rFonts w:ascii="Source Sans Pro" w:eastAsia="Source Sans Pro" w:hAnsi="Source Sans Pro" w:cs="Source Sans Pro"/>
-          <w:color w:val="555555"/>
-          <w:sz w:val="19"/>
-          <w:szCs w:val="19"/>
-        </w:rPr>
-      </w:r>
-      <w:hyperlink r:id="rId10" w:history="1">
-        <w:r>
-          <w:rPr>
-            <w:noProof/>
-          </w:rPr>
-          <w:drawing>
-            <wp:inline distT="0" distB="0" distL="0" distR="0" wp14:anchorId="1A9BA1D9" wp14:editId="5F9CB53B">
-              <wp:extent cx="104775" cy="104775"/>
-              <wp:effectExtent l="0" t="0" r="0" b="0"/>
-              <wp:docPr id="1521653308" name="Picture 1521653308">
-                <a:hlinkClick xmlns:a="http://schemas.openxmlformats.org/drawingml/2006/main" r:id="rId10"/>
-              </wp:docPr>
-              <wp:cNvGraphicFramePr>
-                <a:graphicFrameLocks xmlns:a="http://schemas.openxmlformats.org/drawingml/2006/main" noChangeAspect="1"/>
-              </wp:cNvGraphicFramePr>
-              <a:graphic xmlns:a="http://schemas.openxmlformats.org/drawingml/2006/main">
-                <a:graphicData uri="http://schemas.openxmlformats.org/drawingml/2006/picture">
-                  <pic:pic xmlns:pic="http://schemas.openxmlformats.org/drawingml/2006/picture">
-                    <pic:nvPicPr>
-                      <pic:cNvPr id="0" name="">
-                        <a:hlinkClick r:id="rId10"/>
-                      </pic:cNvPr>
-                      <pic:cNvPicPr>
-                        <a:picLocks noChangeAspect="1" noChangeArrowheads="1"/>
-                      </pic:cNvPicPr>
-                    </pic:nvPicPr>
-                    <pic:blipFill>
-                      <a:blip r:embed="rId9"/>
-                      <a:srcRect/>
-                      <a:stretch>
-                        <a:fillRect/>
-                      </a:stretch>
-                    </pic:blipFill>
-                    <pic:spPr bwMode="auto">
-                      <a:xfrm>
-                        <a:off x="0" y="0"/>
-                        <a:ext cx="104775" cy="104775"/>
-                      </a:xfrm>
-                      <a:prstGeom prst="rect">
-                        <a:avLst/>
-                      </a:prstGeom>
-                    </pic:spPr>
-                  </pic:pic>
-                </a:graphicData>
-              </a:graphic>
-            </wp:inline>
-          </w:drawing>
-        </w:r>
-      </w:hyperlink>
-      <w:r>
-        <w:rPr>
-          <w:rFonts w:ascii="Source Sans Pro" w:eastAsia="Source Sans Pro" w:hAnsi="Source Sans Pro" w:cs="Source Sans Pro"/>
-          <w:sz w:val="19"/>
-          <w:szCs w:val="19"/>
-        </w:rPr>
-      </w:r>
-      <w:r>
-        <w:rPr>
-          <w:rFonts w:ascii="Source Sans Pro" w:eastAsia="Source Sans Pro" w:hAnsi="Source Sans Pro" w:cs="Source Sans Pro"/>
-          <w:color w:val="555555"/>
-          <w:sz w:val="19"/>
-          <w:szCs w:val="19"/>
-        </w:rPr>
+        <w:spacing w:before="13" w:after="33"/>
+      </w:pPr>
+      <w:r>
+        <w:rPr>
+          <w:rFonts w:ascii="Source Sans Pro" w:eastAsia="Source Sans Pro" w:hAnsi="Source Sans Pro" w:cs="Source Sans Pro"/>
+          <w:color w:val="000000"/>
+          <w:sz w:val="19"/>
+          <w:szCs w:val="19"/>
+        </w:rPr>
+        <w:t>Built automated vulnerability assessment pipeline integrating Nessus and OpenVAS REST APIs in Python, generating CVE reports with CVSS severity and EPSS scoring from FIRST.org API.</w:t>
       </w:r>
     </w:p>
     <w:p>
@@ -916,16 +704,16 @@
           <w:ilvl w:val="0"/>
           <w:numId w:val="2"/>
         </w:numPr>
-        <w:spacing w:before="13" w:after="13"/>
-      </w:pPr>
-      <w:r>
-        <w:rPr>
-          <w:rFonts w:ascii="Source Sans Pro" w:eastAsia="Source Sans Pro" w:hAnsi="Source Sans Pro" w:cs="Source Sans Pro"/>
-          <w:color w:val="000000"/>
-          <w:sz w:val="19"/>
-          <w:szCs w:val="19"/>
-        </w:rPr>
-        <w:t>Deployed Splunk SIEM and authored SPL correlation searches for brute-force detection, lateral movement, and privilege escalation; mapped TTPs to MITRE ATT&amp;CK (T1110, T1078, T1059) and wrote PICERL incident report.</w:t>
+        <w:spacing w:before="13" w:after="33"/>
+      </w:pPr>
+      <w:r>
+        <w:rPr>
+          <w:rFonts w:ascii="Source Sans Pro" w:eastAsia="Source Sans Pro" w:hAnsi="Source Sans Pro" w:cs="Source Sans Pro"/>
+          <w:color w:val="000000"/>
+          <w:sz w:val="19"/>
+          <w:szCs w:val="19"/>
+        </w:rPr>
+        <w:t>Developed OWASP Top 10 automated web checker to detect web vulnerabilities (injection, auth, SSRF) and documented SQL injection remediation.</w:t>
       </w:r>
     </w:p>
     <w:p>
@@ -935,16 +723,187 @@
           <w:ilvl w:val="0"/>
           <w:numId w:val="2"/>
         </w:numPr>
-        <w:spacing w:before="13" w:after="13"/>
-      </w:pPr>
-      <w:r>
-        <w:rPr>
-          <w:rFonts w:ascii="Source Sans Pro" w:eastAsia="Source Sans Pro" w:hAnsi="Source Sans Pro" w:cs="Source Sans Pro"/>
-          <w:color w:val="000000"/>
-          <w:sz w:val="19"/>
-          <w:szCs w:val="19"/>
-        </w:rPr>
-        <w:t>Analysed TCP/IP traffic in Wireshark — isolated HTTP/DNS flows, detected plaintext credential exposure, identified SYN scan patterns and DNS tunnelling anomalies indicative of C2 communication.</w:t>
+        <w:spacing w:before="13" w:after="33"/>
+      </w:pPr>
+      <w:r>
+        <w:rPr>
+          <w:rFonts w:ascii="Source Sans Pro" w:eastAsia="Source Sans Pro" w:hAnsi="Source Sans Pro" w:cs="Source Sans Pro"/>
+          <w:color w:val="000000"/>
+          <w:sz w:val="19"/>
+          <w:szCs w:val="19"/>
+        </w:rPr>
+        <w:t>Automated scan scheduling via Bash and cron, flagging new CVEs and calculating remediation SLA deadlines (Critical=24hrs, High=7 days, Medium=30 days).</w:t>
+      </w:r>
+    </w:p>
+    <w:p>
+      <w:pPr>
+        <w:pStyle w:val="ListParagraph"/>
+        <w:spacing w:before="20" w:after="20"/>
+        <w:ind w:left="450"/>
+      </w:pPr>
+    </w:p>
+    <w:p>
+      <w:pPr>
+        <w:pBdr>
+          <w:bottom w:val="single" w:sz="6" w:space="1" w:color="000000"/>
+        </w:pBdr>
+        <w:spacing w:before="116" w:after="0"/>
+      </w:pPr>
+      <w:r>
+        <w:rPr>
+          <w:rFonts w:ascii="Source Sans Pro" w:eastAsia="Source Sans Pro" w:hAnsi="Source Sans Pro" w:cs="Source Sans Pro"/>
+          <w:b/>
+          <w:bCs/>
+          <w:color w:val="000000"/>
+          <w:sz w:val="22"/>
+          <w:szCs w:val="22"/>
+        </w:rPr>
+        <w:t>Technical Skills</w:t>
+      </w:r>
+    </w:p>
+    <w:p>
+      <w:pPr>
+        <w:spacing w:before="48" w:after="48"/>
+      </w:pPr>
+      <w:r>
+        <w:rPr>
+          <w:rFonts w:ascii="Source Sans Pro" w:eastAsia="Source Sans Pro" w:hAnsi="Source Sans Pro" w:cs="Source Sans Pro"/>
+          <w:b/>
+          <w:sz w:val="19"/>
+          <w:szCs w:val="19"/>
+        </w:rPr>
+        <w:t xml:space="preserve">GRC &amp; Compliance: </w:t>
+      </w:r>
+      <w:r>
+        <w:rPr>
+          <w:rFonts w:ascii="Source Sans Pro" w:eastAsia="Source Sans Pro" w:hAnsi="Source Sans Pro" w:cs="Source Sans Pro"/>
+          <w:sz w:val="19"/>
+          <w:szCs w:val="19"/>
+        </w:rPr>
+        <w:t>NIST CSF, ISO 27001, PCI-DSS, GDPR/PDPB, SOX/ITGC, compliance monitoring</w:t>
+      </w:r>
+    </w:p>
+    <w:p>
+      <w:pPr>
+        <w:spacing w:before="48" w:after="48"/>
+      </w:pPr>
+      <w:r>
+        <w:rPr>
+          <w:rFonts w:ascii="Source Sans Pro" w:eastAsia="Source Sans Pro" w:hAnsi="Source Sans Pro" w:cs="Source Sans Pro"/>
+          <w:b/>
+          <w:sz w:val="19"/>
+          <w:szCs w:val="19"/>
+        </w:rPr>
+        <w:t xml:space="preserve">Risk &amp; Audit: </w:t>
+      </w:r>
+      <w:r>
+        <w:rPr>
+          <w:rFonts w:ascii="Source Sans Pro" w:eastAsia="Source Sans Pro" w:hAnsi="Source Sans Pro" w:cs="Source Sans Pro"/>
+          <w:sz w:val="19"/>
+          <w:szCs w:val="19"/>
+        </w:rPr>
+        <w:t>Risk assessment, control testing, audit documentation, vendor risk, RCSA basics</w:t>
+      </w:r>
+    </w:p>
+    <w:p>
+      <w:pPr>
+        <w:spacing w:before="48" w:after="48"/>
+      </w:pPr>
+      <w:r>
+        <w:rPr>
+          <w:rFonts w:ascii="Source Sans Pro" w:eastAsia="Source Sans Pro" w:hAnsi="Source Sans Pro" w:cs="Source Sans Pro"/>
+          <w:b/>
+          <w:sz w:val="19"/>
+          <w:szCs w:val="19"/>
+        </w:rPr>
+        <w:t xml:space="preserve">Fraud &amp; AML: </w:t>
+      </w:r>
+      <w:r>
+        <w:rPr>
+          <w:rFonts w:ascii="Source Sans Pro" w:eastAsia="Source Sans Pro" w:hAnsi="Source Sans Pro" w:cs="Source Sans Pro"/>
+          <w:sz w:val="19"/>
+          <w:szCs w:val="19"/>
+        </w:rPr>
+        <w:t>Transaction monitoring, AML typologies, KYC/CDD, sanctions screening</w:t>
+      </w:r>
+    </w:p>
+    <w:p>
+      <w:pPr>
+        <w:spacing w:before="48" w:after="48"/>
+      </w:pPr>
+      <w:r>
+        <w:rPr>
+          <w:rFonts w:ascii="Source Sans Pro" w:eastAsia="Source Sans Pro" w:hAnsi="Source Sans Pro" w:cs="Source Sans Pro"/>
+          <w:b/>
+          <w:sz w:val="19"/>
+          <w:szCs w:val="19"/>
+        </w:rPr>
+        <w:t xml:space="preserve">Systems &amp; Tools: </w:t>
+      </w:r>
+      <w:r>
+        <w:rPr>
+          <w:rFonts w:ascii="Source Sans Pro" w:eastAsia="Source Sans Pro" w:hAnsi="Source Sans Pro" w:cs="Source Sans Pro"/>
+          <w:sz w:val="19"/>
+          <w:szCs w:val="19"/>
+        </w:rPr>
+        <w:t>Windows internals, Linux fundamentals, Python, Excel, SQL (basic), TCP/IP basics</w:t>
+      </w:r>
+    </w:p>
+    <w:p>
+      <w:pPr>
+        <w:spacing w:before="48" w:after="48"/>
+      </w:pPr>
+      <w:r>
+        <w:rPr>
+          <w:rFonts w:ascii="Source Sans Pro" w:eastAsia="Source Sans Pro" w:hAnsi="Source Sans Pro" w:cs="Source Sans Pro"/>
+          <w:b/>
+          <w:sz w:val="19"/>
+          <w:szCs w:val="19"/>
+        </w:rPr>
+        <w:t xml:space="preserve">Frameworks: </w:t>
+      </w:r>
+      <w:r>
+        <w:rPr>
+          <w:rFonts w:ascii="Source Sans Pro" w:eastAsia="Source Sans Pro" w:hAnsi="Source Sans Pro" w:cs="Source Sans Pro"/>
+          <w:sz w:val="19"/>
+          <w:szCs w:val="19"/>
+        </w:rPr>
+        <w:t>MITRE ATT&amp;CK, OWASP Top 10, Incident Response (PICERL), audit trail documentation, controls</w:t>
+      </w:r>
+    </w:p>
+    <w:p>
+      <w:pPr>
+        <w:pBdr>
+          <w:bottom w:val="single" w:sz="6" w:space="1" w:color="000000"/>
+        </w:pBdr>
+        <w:spacing w:before="20" w:after="20"/>
+        <w:rPr>
+          <w:rFonts w:ascii="Source Sans Pro" w:eastAsia="Source Sans Pro" w:hAnsi="Source Sans Pro" w:cs="Source Sans Pro"/>
+          <w:b/>
+          <w:bCs/>
+          <w:color w:val="000000"/>
+          <w:sz w:val="22"/>
+          <w:szCs w:val="22"/>
+        </w:rPr>
+      </w:pPr>
+    </w:p>
+    <w:p>
+      <w:pPr>
+        <w:pBdr>
+          <w:bottom w:val="single" w:sz="6" w:space="1" w:color="000000"/>
+        </w:pBdr>
+        <w:spacing w:before="116" w:after="0"/>
+      </w:pPr>
+      <w:r>
+        <w:rPr>
+          <w:rFonts w:ascii="Source Sans Pro" w:eastAsia="Source Sans Pro" w:hAnsi="Source Sans Pro" w:cs="Source Sans Pro"/>
+          <w:b/>
+          <w:bCs/>
+          <w:color w:val="000000"/>
+          <w:sz w:val="22"/>
+          <w:szCs w:val="22"/>
+        </w:rPr>
+        <w:t>Certifications</w:t>
       </w:r>
     </w:p>
     <w:p>
@@ -954,16 +913,16 @@
           <w:ilvl w:val="0"/>
           <w:numId w:val="2"/>
         </w:numPr>
-        <w:spacing w:before="13" w:after="13"/>
-      </w:pPr>
-      <w:r>
-        <w:rPr>
-          <w:rFonts w:ascii="Source Sans Pro" w:eastAsia="Source Sans Pro" w:hAnsi="Source Sans Pro" w:cs="Source Sans Pro"/>
-          <w:color w:val="000000"/>
-          <w:sz w:val="19"/>
-          <w:szCs w:val="19"/>
-        </w:rPr>
-        <w:t>Conducted network reconnaissance with Nmap (host discovery, OS fingerprinting, service-version detection) and SQL injection testing; documented OWASP Top 10 parameterised query remediation.</w:t>
+        <w:spacing w:before="13" w:after="33"/>
+      </w:pPr>
+      <w:r>
+        <w:rPr>
+          <w:rFonts w:ascii="Source Sans Pro" w:eastAsia="Source Sans Pro" w:hAnsi="Source Sans Pro" w:cs="Source Sans Pro"/>
+          <w:color w:val="000000"/>
+          <w:sz w:val="19"/>
+          <w:szCs w:val="19"/>
+        </w:rPr>
+        <w:t>CompTIA Security+ SY0-701  —  in progress, exam target Q3 2026</w:t>
       </w:r>
     </w:p>
     <w:p>
@@ -973,341 +932,7 @@
           <w:ilvl w:val="0"/>
           <w:numId w:val="2"/>
         </w:numPr>
-        <w:spacing w:before="13" w:after="13"/>
-      </w:pPr>
-      <w:r>
-        <w:rPr>
-          <w:rFonts w:ascii="Source Sans Pro" w:eastAsia="Source Sans Pro" w:hAnsi="Source Sans Pro" w:cs="Source Sans Pro"/>
-          <w:color w:val="000000"/>
-          <w:sz w:val="19"/>
-          <w:szCs w:val="19"/>
-        </w:rPr>
-        <w:t>Completed 9 TryHackMe rooms: Windows Event Logs, Active Directory Basics, Phishing Analysis, SIEM fundamentals, and threat hunting — building hands-on SOC Tier 1 analyst skills.</w:t>
-      </w:r>
-    </w:p>
-    <w:p>
-      <w:pPr>
-        <w:pBdr>
-          <w:bottom w:val="single" w:sz="6" w:space="1" w:color="000000"/>
-        </w:pBdr>
-        <w:spacing w:before="155" w:after="52"/>
-        <w:rPr>
-          <w:rFonts w:ascii="Source Sans Pro" w:eastAsia="Source Sans Pro" w:hAnsi="Source Sans Pro" w:cs="Source Sans Pro"/>
-          <w:b/>
-          <w:bCs/>
-          <w:color w:val="000000"/>
-          <w:sz w:val="22"/>
-          <w:szCs w:val="22"/>
-        </w:rPr>
-      </w:pPr>
-    </w:p>
-    <w:p>
-      <w:pPr>
-        <w:pBdr>
-          <w:bottom w:val="single" w:sz="6" w:space="1" w:color="000000"/>
-        </w:pBdr>
-        <w:spacing w:before="155" w:after="52"/>
-      </w:pPr>
-      <w:r>
-        <w:rPr>
-          <w:rFonts w:ascii="Source Sans Pro" w:eastAsia="Source Sans Pro" w:hAnsi="Source Sans Pro" w:cs="Source Sans Pro"/>
-          <w:b/>
-          <w:bCs/>
-          <w:color w:val="000000"/>
-          <w:sz w:val="22"/>
-          <w:szCs w:val="22"/>
-        </w:rPr>
-        <w:t>Technical Skills</w:t>
-      </w:r>
-    </w:p>
-    <w:p>
-      <w:pPr>
-        <w:spacing w:before="24" w:after="24"/>
-      </w:pPr>
-      <w:r>
-        <w:rPr>
-          <w:rFonts w:ascii="Source Sans Pro" w:eastAsia="Source Sans Pro" w:hAnsi="Source Sans Pro" w:cs="Source Sans Pro"/>
-          <w:b/>
-          <w:bCs/>
-          <w:color w:val="000000"/>
-          <w:sz w:val="19"/>
-          <w:szCs w:val="19"/>
-        </w:rPr>
-        <w:t>Networking:  TCP/IP, DNS, HTTP/S, firewall concepts, IDS/IPS concepts</w:t>
-      </w:r>
-      <w:r>
-        <w:rPr>
-          <w:rFonts w:ascii="Source Sans Pro" w:eastAsia="Source Sans Pro" w:hAnsi="Source Sans Pro" w:cs="Source Sans Pro"/>
-          <w:b/>
-          <w:bCs/>
-          <w:color w:val="000000"/>
-          <w:sz w:val="19"/>
-          <w:szCs w:val="19"/>
-        </w:rPr>
-      </w:r>
-      <w:r>
-        <w:rPr>
-          <w:rFonts w:ascii="Source Sans Pro" w:eastAsia="Source Sans Pro" w:hAnsi="Source Sans Pro" w:cs="Source Sans Pro"/>
-          <w:color w:val="000000"/>
-          <w:sz w:val="19"/>
-          <w:szCs w:val="19"/>
-        </w:rPr>
-      </w:r>
-    </w:p>
-    <w:p>
-      <w:pPr>
-        <w:spacing w:before="24" w:after="24"/>
-      </w:pPr>
-      <w:r>
-        <w:rPr>
-          <w:rFonts w:ascii="Source Sans Pro" w:eastAsia="Source Sans Pro" w:hAnsi="Source Sans Pro" w:cs="Source Sans Pro"/>
-          <w:b/>
-          <w:bCs/>
-          <w:color w:val="000000"/>
-          <w:sz w:val="19"/>
-          <w:szCs w:val="19"/>
-        </w:rPr>
-        <w:t>OS &amp; Scripting:  Linux (grep, netstat, log analysis), Windows internals, Active Directory (basics), PowerShell (basic), Python, Bash</w:t>
-      </w:r>
-      <w:r>
-        <w:rPr>
-          <w:rFonts w:ascii="Source Sans Pro" w:eastAsia="Source Sans Pro" w:hAnsi="Source Sans Pro" w:cs="Source Sans Pro"/>
-          <w:b/>
-          <w:bCs/>
-          <w:color w:val="000000"/>
-          <w:sz w:val="19"/>
-          <w:szCs w:val="19"/>
-        </w:rPr>
-      </w:r>
-      <w:r>
-        <w:rPr>
-          <w:rFonts w:ascii="Source Sans Pro" w:eastAsia="Source Sans Pro" w:hAnsi="Source Sans Pro" w:cs="Source Sans Pro"/>
-          <w:color w:val="000000"/>
-          <w:sz w:val="19"/>
-          <w:szCs w:val="19"/>
-        </w:rPr>
-      </w:r>
-    </w:p>
-    <w:p>
-      <w:pPr>
-        <w:spacing w:before="24" w:after="24"/>
-      </w:pPr>
-      <w:r>
-        <w:rPr>
-          <w:rFonts w:ascii="Source Sans Pro" w:eastAsia="Source Sans Pro" w:hAnsi="Source Sans Pro" w:cs="Source Sans Pro"/>
-          <w:b/>
-          <w:bCs/>
-          <w:color w:val="000000"/>
-          <w:sz w:val="19"/>
-          <w:szCs w:val="19"/>
-        </w:rPr>
-        <w:t>Risk &amp; Investigation:  Root cause analysis, policy-based case evaluation, audit documentation</w:t>
-      </w:r>
-      <w:r>
-        <w:rPr>
-          <w:rFonts w:ascii="Source Sans Pro" w:eastAsia="Source Sans Pro" w:hAnsi="Source Sans Pro" w:cs="Source Sans Pro"/>
-          <w:b/>
-          <w:bCs/>
-          <w:color w:val="000000"/>
-          <w:sz w:val="19"/>
-          <w:szCs w:val="19"/>
-        </w:rPr>
-      </w:r>
-      <w:r>
-        <w:rPr>
-          <w:rFonts w:ascii="Source Sans Pro" w:eastAsia="Source Sans Pro" w:hAnsi="Source Sans Pro" w:cs="Source Sans Pro"/>
-          <w:color w:val="000000"/>
-          <w:sz w:val="19"/>
-          <w:szCs w:val="19"/>
-        </w:rPr>
-      </w:r>
-    </w:p>
-    <w:p>
-      <w:pPr>
-        <w:spacing w:before="24" w:after="24"/>
-      </w:pPr>
-      <w:r>
-        <w:rPr>
-          <w:rFonts w:ascii="Source Sans Pro" w:eastAsia="Source Sans Pro" w:hAnsi="Source Sans Pro" w:cs="Source Sans Pro"/>
-          <w:b/>
-          <w:bCs/>
-          <w:color w:val="000000"/>
-          <w:sz w:val="19"/>
-          <w:szCs w:val="19"/>
-        </w:rPr>
-        <w:t>SIEM &amp; Tools:  Splunk (SPL), Wireshark, PCAP analysis, Windows Event Logs, Nmap</w:t>
-      </w:r>
-      <w:r>
-        <w:rPr>
-          <w:rFonts w:ascii="Source Sans Pro" w:eastAsia="Source Sans Pro" w:hAnsi="Source Sans Pro" w:cs="Source Sans Pro"/>
-          <w:b/>
-          <w:bCs/>
-          <w:color w:val="000000"/>
-          <w:sz w:val="19"/>
-          <w:szCs w:val="19"/>
-        </w:rPr>
-      </w:r>
-      <w:r>
-        <w:rPr>
-          <w:rFonts w:ascii="Source Sans Pro" w:eastAsia="Source Sans Pro" w:hAnsi="Source Sans Pro" w:cs="Source Sans Pro"/>
-          <w:color w:val="000000"/>
-          <w:sz w:val="19"/>
-          <w:szCs w:val="19"/>
-        </w:rPr>
-      </w:r>
-    </w:p>
-    <w:p>
-      <w:pPr>
-        <w:spacing w:before="24" w:after="24"/>
-      </w:pPr>
-      <w:r>
-        <w:rPr>
-          <w:rFonts w:ascii="Source Sans Pro" w:eastAsia="Source Sans Pro" w:hAnsi="Source Sans Pro" w:cs="Source Sans Pro"/>
-          <w:b/>
-          <w:bCs/>
-          <w:color w:val="000000"/>
-          <w:sz w:val="19"/>
-          <w:szCs w:val="19"/>
-        </w:rPr>
-        <w:t>Security Operations Center (SOC):  Alert triage, log analysis, security monitoring, threat detection, incident escalation, endpoint security, ticketing system workflows</w:t>
-      </w:r>
-      <w:proofErr w:type="spellStart"/>
-      <w:r>
-        <w:rPr>
-          <w:rFonts w:ascii="Source Sans Pro" w:eastAsia="Source Sans Pro" w:hAnsi="Source Sans Pro" w:cs="Source Sans Pro"/>
-          <w:b/>
-          <w:bCs/>
-          <w:color w:val="000000"/>
-          <w:sz w:val="19"/>
-          <w:szCs w:val="19"/>
-        </w:rPr>
-      </w:r>
-      <w:proofErr w:type="spellEnd"/>
-      <w:r>
-        <w:rPr>
-          <w:rFonts w:ascii="Source Sans Pro" w:eastAsia="Source Sans Pro" w:hAnsi="Source Sans Pro" w:cs="Source Sans Pro"/>
-          <w:b/>
-          <w:bCs/>
-          <w:color w:val="000000"/>
-          <w:sz w:val="19"/>
-          <w:szCs w:val="19"/>
-        </w:rPr>
-      </w:r>
-      <w:r>
-        <w:rPr>
-          <w:rFonts w:ascii="Source Sans Pro" w:eastAsia="Source Sans Pro" w:hAnsi="Source Sans Pro" w:cs="Source Sans Pro"/>
-          <w:b/>
-          <w:bCs/>
-          <w:color w:val="000000"/>
-          <w:sz w:val="19"/>
-          <w:szCs w:val="19"/>
-        </w:rPr>
-      </w:r>
-      <w:r>
-        <w:rPr>
-          <w:rFonts w:ascii="Source Sans Pro" w:eastAsia="Source Sans Pro" w:hAnsi="Source Sans Pro" w:cs="Source Sans Pro"/>
-          <w:color w:val="000000"/>
-          <w:sz w:val="19"/>
-          <w:szCs w:val="19"/>
-        </w:rPr>
-      </w:r>
-    </w:p>
-    <w:p>
-      <w:pPr>
-        <w:spacing w:before="24" w:after="24"/>
-      </w:pPr>
-      <w:r>
-        <w:rPr>
-          <w:rFonts w:ascii="Source Sans Pro" w:eastAsia="Source Sans Pro" w:hAnsi="Source Sans Pro" w:cs="Source Sans Pro"/>
-          <w:b/>
-          <w:bCs/>
-          <w:color w:val="000000"/>
-          <w:sz w:val="19"/>
-          <w:szCs w:val="19"/>
-        </w:rPr>
-        <w:t>Security Frameworks:  MITRE ATT&amp;CK, Incident Response (PICERL), OWASP Top 10</w:t>
-      </w:r>
-      <w:r>
-        <w:rPr>
-          <w:rFonts w:ascii="Source Sans Pro" w:eastAsia="Source Sans Pro" w:hAnsi="Source Sans Pro" w:cs="Source Sans Pro"/>
-          <w:b/>
-          <w:bCs/>
-          <w:color w:val="000000"/>
-          <w:sz w:val="19"/>
-          <w:szCs w:val="19"/>
-        </w:rPr>
-      </w:r>
-      <w:r>
-        <w:rPr>
-          <w:rFonts w:ascii="Source Sans Pro" w:eastAsia="Source Sans Pro" w:hAnsi="Source Sans Pro" w:cs="Source Sans Pro"/>
-          <w:color w:val="000000"/>
-          <w:sz w:val="19"/>
-          <w:szCs w:val="19"/>
-        </w:rPr>
-      </w:r>
-    </w:p>
-    <w:p>
-      <w:pPr>
-        <w:pBdr>
-          <w:bottom w:val="single" w:sz="6" w:space="1" w:color="000000"/>
-        </w:pBdr>
-        <w:spacing w:before="155" w:after="52"/>
-        <w:rPr>
-          <w:rFonts w:ascii="Source Sans Pro" w:eastAsia="Source Sans Pro" w:hAnsi="Source Sans Pro" w:cs="Source Sans Pro"/>
-          <w:b/>
-          <w:bCs/>
-          <w:color w:val="000000"/>
-          <w:sz w:val="22"/>
-          <w:szCs w:val="22"/>
-        </w:rPr>
-      </w:pPr>
-    </w:p>
-    <w:p>
-      <w:pPr>
-        <w:pBdr>
-          <w:bottom w:val="single" w:sz="6" w:space="1" w:color="000000"/>
-        </w:pBdr>
-        <w:spacing w:before="155" w:after="52"/>
-      </w:pPr>
-      <w:r>
-        <w:rPr>
-          <w:rFonts w:ascii="Source Sans Pro" w:eastAsia="Source Sans Pro" w:hAnsi="Source Sans Pro" w:cs="Source Sans Pro"/>
-          <w:b/>
-          <w:bCs/>
-          <w:color w:val="000000"/>
-          <w:sz w:val="22"/>
-          <w:szCs w:val="22"/>
-        </w:rPr>
-        <w:t>Certifications</w:t>
-      </w:r>
-    </w:p>
-    <w:p>
-      <w:pPr>
-        <w:pStyle w:val="ListParagraph"/>
-        <w:numPr>
-          <w:ilvl w:val="0"/>
-          <w:numId w:val="2"/>
-        </w:numPr>
-        <w:spacing w:before="13" w:after="13"/>
-      </w:pPr>
-      <w:r>
-        <w:rPr>
-          <w:rFonts w:ascii="Source Sans Pro" w:eastAsia="Source Sans Pro" w:hAnsi="Source Sans Pro" w:cs="Source Sans Pro"/>
-          <w:color w:val="000000"/>
-          <w:sz w:val="19"/>
-          <w:szCs w:val="19"/>
-        </w:rPr>
-        <w:t>CompTIA Security+ SY0-701  —  in progress, exam target Q3 2026</w:t>
-      </w:r>
-    </w:p>
-    <w:p>
-      <w:pPr>
-        <w:pStyle w:val="ListParagraph"/>
-        <w:numPr>
-          <w:ilvl w:val="0"/>
-          <w:numId w:val="2"/>
-        </w:numPr>
-        <w:spacing w:before="13" w:after="13"/>
+        <w:spacing w:before="13" w:after="33"/>
       </w:pPr>
       <w:r>
         <w:rPr>

</xml_diff>